<commit_message>
Regenerate submission Noether .docx from corrected .tex (pandoc)
0 residual old claims; new title + representation-invariant framing; math (OMML)
preserved; S4/S5 remarks and S9.5 negation micro-test included.

Co-Authored-By: Claude Opus 4.8 (1M context) <noreply@anthropic.com>
</commit_message>
<xml_diff>
--- a/docs/papers/foundations/submission/anonymous/Noether_Ethics_Paper.docx
+++ b/docs/papers/foundations/submission/anonymous/Noether_Ethics_Paper.docx
@@ -11,7 +11,7 @@
           <w:b/>
           <w:bCs/>
         </w:rPr>
-        <w:t xml:space="preserve">Noether’s Theorem for Ethics:</w:t>
+        <w:t xml:space="preserve">Noether-Style Reasoning for Ethics:</w:t>
       </w:r>
       <w:r>
         <w:br/>
@@ -21,7 +21,7 @@
           <w:b/>
           <w:bCs/>
         </w:rPr>
-        <w:t xml:space="preserve">Harm Accounting and the Formal Structure</w:t>
+        <w:t xml:space="preserve">Representation-Invariant Harm Accounting</w:t>
       </w:r>
       <w:r>
         <w:br/>
@@ -31,7 +31,7 @@
           <w:b/>
           <w:bCs/>
         </w:rPr>
-        <w:t xml:space="preserve">of Normative Coherence</w:t>
+        <w:t xml:space="preserve">and the Gauge Analogy of Normative Coherence</w:t>
       </w:r>
     </w:p>
     <w:p>
@@ -76,7 +76,7 @@
         <w:t xml:space="preserve">harm accounting must be representation-invariant</w:t>
       </w:r>
       <w:r>
-        <w:t xml:space="preserve">. Just as physical observables cannot depend on gauge choices, ethical harm cannot appear or disappear merely through re-description. Genuine repair is possible—but it must register consistently across all representations. This is not metaphor but formal analogy: the same structural pattern, applied to different domains. We develop the correspondence between electrodynamics and ethics, identifying harm density</w:t>
+        <w:t xml:space="preserve">. Just as physical observables cannot depend on gauge choices, ethical harm cannot appear or disappear merely through re-description. Genuine repair is possible—but it must register consistently across all representations. This is not metaphor but formal analogy: the same structural pattern, applied to different domains—though, we stress, a structural analogy and not an identity, since the ethics side fixes no metric, Lagrangian, or dynamics. We develop the correspondence between electrodynamics and ethics, identifying harm density</w:t>
       </w:r>
       <w:r>
         <w:t xml:space="preserve"> </w:t>
@@ -130,7 +130,20 @@
         <w:t xml:space="preserve"> </w:t>
       </w:r>
       <w:r>
-        <w:t xml:space="preserve">with electric current, and deriving the ethical accounting equation</w:t>
+        <w:t xml:space="preserve">with electric current, and</w:t>
+      </w:r>
+      <w:r>
+        <w:t xml:space="preserve"> </w:t>
+      </w:r>
+      <w:r>
+        <w:rPr>
+          <w:i/>
+          <w:iCs/>
+        </w:rPr>
+        <w:t xml:space="preserve">positing</w:t>
+      </w:r>
+      <w:r>
+        <w:t xml:space="preserve">—as an illustrative analogy rather than a derivation from an ethical action—the accounting equation</w:t>
       </w:r>
       <w:r>
         <w:t xml:space="preserve"> </w:t>
@@ -246,7 +259,7 @@
         <w:t xml:space="preserve"> </w:t>
       </w:r>
       <w:r>
-        <w:t xml:space="preserve">changes under re-description. We explore the implications for consequentialism, retributive justice, restorative justice, and the foundations of moral philosophy. We argue that this structural correspondence suggests a deeper mathematical framework—possibly rooted in information geometry or homotopy type theory—underlying both physical and normative reasoning. Throughout, we maintain epistemic humility: we claim not that this structure reveals metaphysical necessity, but that it provides a powerful, empirically grounded tool for understanding the formal constraints on coherent ethical reasoning. The implications for AI alignment are immediate: systems whose harm accounting is representation-dependent are incoherent in a mathematically precise sense.</w:t>
+        <w:t xml:space="preserve">changes under re-description. We are explicit throughout about which claims are load-bearing (the coherence/invariance constraint, which is testable) and which are suggestive analogy (the field equations); the empirical support we report is preliminary and carries a stated encoder confound. We explore the implications for consequentialism, retributive justice, restorative justice, and the foundations of moral philosophy. We argue that this structural correspondence suggests a deeper mathematical framework—possibly rooted in information geometry or homotopy type theory—underlying both physical and normative reasoning. Throughout, we maintain epistemic humility: we claim not that this structure reveals metaphysical necessity, but that it provides a powerful, empirically grounded tool for understanding the formal constraints on coherent ethical reasoning. The implications for AI alignment are immediate: systems whose harm accounting is representation-dependent are incoherent in a mathematically precise sense.</w:t>
       </w:r>
     </w:p>
     <w:p>
@@ -281,7 +294,7 @@
         <w:pStyle w:val="FirstParagraph"/>
       </w:pPr>
       <w:r>
-        <w:t xml:space="preserve">In 2025, while developing a categorical framework for verifying representational consistency in AI systems, we noticed something strange. The mathematics we were using—groupoids, double categories, connections, curvature—was identical to the mathematics of gauge theory in physics. Not merely analogous.</w:t>
+        <w:t xml:space="preserve">In 2025, while developing a categorical framework for verifying representational consistency in AI systems, we noticed something strange. The mathematics we were using—groupoids, double categories, connections, curvature—was the</w:t>
       </w:r>
       <w:r>
         <w:t xml:space="preserve"> </w:t>
@@ -291,10 +304,45 @@
           <w:i/>
           <w:iCs/>
         </w:rPr>
-        <w:t xml:space="preserve">Identical</w:t>
-      </w:r>
-      <w:r>
-        <w:t xml:space="preserve">.</w:t>
+        <w:t xml:space="preserve">same organizing structure</w:t>
+      </w:r>
+      <w:r>
+        <w:t xml:space="preserve"> </w:t>
+      </w:r>
+      <w:r>
+        <w:t xml:space="preserve">as the mathematics of gauge theory in physics: the same pattern of symmetry, connection, and curvature, not a loose metaphor. We deliberately do</w:t>
+      </w:r>
+      <w:r>
+        <w:t xml:space="preserve"> </w:t>
+      </w:r>
+      <w:r>
+        <w:rPr>
+          <w:i/>
+          <w:iCs/>
+        </w:rPr>
+        <w:t xml:space="preserve">not</w:t>
+      </w:r>
+      <w:r>
+        <w:t xml:space="preserve"> </w:t>
+      </w:r>
+      <w:r>
+        <w:t xml:space="preserve">claim identity: the ethics side has no metric, no Lagrangian, and no dynamics pinned down, so what we have is a precise</w:t>
+      </w:r>
+      <w:r>
+        <w:t xml:space="preserve"> </w:t>
+      </w:r>
+      <w:r>
+        <w:rPr>
+          <w:i/>
+          <w:iCs/>
+        </w:rPr>
+        <w:t xml:space="preserve">structural</w:t>
+      </w:r>
+      <w:r>
+        <w:t xml:space="preserve"> </w:t>
+      </w:r>
+      <w:r>
+        <w:t xml:space="preserve">analogy—shared pattern, not shared content. That distinction governs the rest of the paper, and we are careful below to mark where the analogy is load-bearing and where it is merely suggestive.</w:t>
       </w:r>
     </w:p>
     <w:p>
@@ -4966,6 +5014,147 @@
         <w:t xml:space="preserve">When discrete transforms can be embedded in a continuous group (e.g., option reorderings as permutations embedded in a continuous deformation), the full Noether machinery applies, and we obtain a differential conservation law. This justifies treating the continuous case as a limiting idealization, much as discrete lattice models in physics approach continuum field theories.</w:t>
       </w:r>
     </w:p>
+    <w:p>
+      <w:pPr>
+        <w:pStyle w:val="BodyText"/>
+      </w:pPr>
+      <w:r>
+        <w:rPr>
+          <w:i/>
+          <w:iCs/>
+        </w:rPr>
+        <w:t xml:space="preserve">Remark 9</w:t>
+      </w:r>
+      <w:r>
+        <w:t xml:space="preserve"> </w:t>
+      </w:r>
+      <w:r>
+        <w:t xml:space="preserve">(What the symmetry argument does and does not establish).</w:t>
+      </w:r>
+      <w:r>
+        <w:t xml:space="preserve"> </w:t>
+      </w:r>
+      <w:r>
+        <w:t xml:space="preserve"> </w:t>
+      </w:r>
+      <w:r>
+        <w:t xml:space="preserve">For the discrete re-description groupoid that actually arises in practice, this is</w:t>
+      </w:r>
+      <w:r>
+        <w:t xml:space="preserve"> </w:t>
+      </w:r>
+      <w:r>
+        <w:rPr>
+          <w:i/>
+          <w:iCs/>
+        </w:rPr>
+        <w:t xml:space="preserve">not</w:t>
+      </w:r>
+      <w:r>
+        <w:t xml:space="preserve"> </w:t>
+      </w:r>
+      <w:r>
+        <w:t xml:space="preserve">Noether’s theorem in its load-bearing sense. Noether’s content in physics is that a continuous symmetry of a</w:t>
+      </w:r>
+      <w:r>
+        <w:t xml:space="preserve"> </w:t>
+      </w:r>
+      <w:r>
+        <w:rPr>
+          <w:i/>
+          <w:iCs/>
+        </w:rPr>
+        <w:t xml:space="preserve">dynamics</w:t>
+      </w:r>
+      <w:r>
+        <w:t xml:space="preserve"> </w:t>
+      </w:r>
+      <w:r>
+        <w:t xml:space="preserve">(an action) yields a</w:t>
+      </w:r>
+      <w:r>
+        <w:t xml:space="preserve"> </w:t>
+      </w:r>
+      <w:r>
+        <w:rPr>
+          <w:i/>
+          <w:iCs/>
+        </w:rPr>
+        <w:t xml:space="preserve">non-obvious</w:t>
+      </w:r>
+      <w:r>
+        <w:t xml:space="preserve"> </w:t>
+      </w:r>
+      <w:r>
+        <w:t xml:space="preserve">conserved current—one you could not read off in advance (phase symmetry</w:t>
+      </w:r>
+      <w:r>
+        <w:t xml:space="preserve"> </w:t>
+      </w:r>
+      <m:oMath>
+        <m:r>
+          <m:rPr>
+            <m:sty m:val="p"/>
+          </m:rPr>
+          <m:t>⇒</m:t>
+        </m:r>
+      </m:oMath>
+      <w:r>
+        <w:t xml:space="preserve"> </w:t>
+      </w:r>
+      <w:r>
+        <w:t xml:space="preserve">electric charge). Here there is no action and the symmetry is discrete, so what remains is the near-definitional fact that a quantity</w:t>
+      </w:r>
+      <w:r>
+        <w:t xml:space="preserve"> </w:t>
+      </w:r>
+      <w:r>
+        <w:rPr>
+          <w:i/>
+          <w:iCs/>
+        </w:rPr>
+        <w:t xml:space="preserve">declared</w:t>
+      </w:r>
+      <w:r>
+        <w:t xml:space="preserve"> </w:t>
+      </w:r>
+      <w:r>
+        <w:t xml:space="preserve">invariant under the groupoid is constant on its orbits. The real work is done by the modeling choice—that harm is among the re-description invariants—not by Noether’s theorem. We keep the Noether framing because it correctly names the</w:t>
+      </w:r>
+      <w:r>
+        <w:t xml:space="preserve"> </w:t>
+      </w:r>
+      <w:r>
+        <w:rPr>
+          <w:i/>
+          <w:iCs/>
+        </w:rPr>
+        <w:t xml:space="preserve">pattern</w:t>
+      </w:r>
+      <w:r>
+        <w:t xml:space="preserve"> </w:t>
+      </w:r>
+      <w:r>
+        <w:t xml:space="preserve">(symmetry</w:t>
+      </w:r>
+      <w:r>
+        <w:t xml:space="preserve"> </w:t>
+      </w:r>
+      <m:oMath>
+        <m:r>
+          <m:rPr>
+            <m:sty m:val="p"/>
+          </m:rPr>
+          <m:t>⇒</m:t>
+        </m:r>
+      </m:oMath>
+      <w:r>
+        <w:t xml:space="preserve"> </w:t>
+      </w:r>
+      <w:r>
+        <w:t xml:space="preserve">invariant) and because the continuous idealization does admit the full machinery; but the honest, load-bearing claim is the coherence constraint below, not a derived conservation law. Its real content is empirical: whether a given system’s harm judgments actually respect the invariance (§9.4–9.5).</w:t>
+      </w:r>
+    </w:p>
     <w:bookmarkEnd w:id="22"/>
     <w:bookmarkStart w:id="23" w:name="identifying-the-conserved-quantity"/>
     <w:p>
@@ -5230,7 +5419,7 @@
           <w:b/>
           <w:bCs/>
         </w:rPr>
-        <w:t xml:space="preserve">Theorem 9</w:t>
+        <w:t xml:space="preserve">Theorem 10</w:t>
       </w:r>
       <w:r>
         <w:t xml:space="preserve"> </w:t>
@@ -5795,7 +5984,20 @@
         <w:t xml:space="preserve"> </w:t>
       </w:r>
       <w:r>
-        <w:t xml:space="preserve">The proof follows the Noether argument for the continuous case. For the discrete case, the result follows from the requirement that harm accounting be representation-independent: if</w:t>
+        <w:t xml:space="preserve">The continuous form follows the Noether argument under the idealization of §4.2. For the discrete case—the one that actually arises—the statement is a</w:t>
+      </w:r>
+      <w:r>
+        <w:t xml:space="preserve"> </w:t>
+      </w:r>
+      <w:r>
+        <w:rPr>
+          <w:i/>
+          <w:iCs/>
+        </w:rPr>
+        <w:t xml:space="preserve">consistency requirement</w:t>
+      </w:r>
+      <w:r>
+        <w:t xml:space="preserve">, not an independently derived law: if</w:t>
       </w:r>
       <w:r>
         <w:t xml:space="preserve"> </w:t>
@@ -5874,7 +6076,19 @@
         </m:r>
       </m:oMath>
       <w:r>
-        <w:t xml:space="preserve">, then the harm ledger depends on representational choices, which contradicts the definition of bond-preserving transforms. ◻</w:t>
+        <w:t xml:space="preserve">, the harm ledger depends on representational choices, contradicting the definition of a bond-preserving transform. In other words, the discrete</w:t>
+      </w:r>
+      <w:r>
+        <w:t xml:space="preserve"> </w:t>
+      </w:r>
+      <w:r>
+        <w:t xml:space="preserve">“theorem”</w:t>
+      </w:r>
+      <w:r>
+        <w:t xml:space="preserve"> </w:t>
+      </w:r>
+      <w:r>
+        <w:t xml:space="preserve">is definitional given the modeling choice that harm is bond-invariant; the differential equation is its continuous idealization. Its non-trivial content is empirical (§9.4–9.5): whether real evaluators honour the constraint. ◻</w:t>
       </w:r>
     </w:p>
     <w:p>
@@ -5886,7 +6100,7 @@
           <w:i/>
           <w:iCs/>
         </w:rPr>
-        <w:t xml:space="preserve">Remark 10</w:t>
+        <w:t xml:space="preserve">Remark 11</w:t>
       </w:r>
       <w:r>
         <w:t xml:space="preserve">.</w:t>
@@ -6216,6 +6430,152 @@
       </w:pPr>
       <w:r>
         <w:t xml:space="preserve">We now develop the complete correspondence between electrodynamics and ethics.</w:t>
+      </w:r>
+    </w:p>
+    <w:p>
+      <w:pPr>
+        <w:pStyle w:val="BodyText"/>
+      </w:pPr>
+      <w:r>
+        <w:rPr>
+          <w:i/>
+          <w:iCs/>
+        </w:rPr>
+        <w:t xml:space="preserve">Remark 12</w:t>
+      </w:r>
+      <w:r>
+        <w:t xml:space="preserve"> </w:t>
+      </w:r>
+      <w:r>
+        <w:t xml:space="preserve">(Status of this section: suggestive analogy, not derived result).</w:t>
+      </w:r>
+      <w:r>
+        <w:t xml:space="preserve"> </w:t>
+      </w:r>
+      <w:r>
+        <w:t xml:space="preserve"> </w:t>
+      </w:r>
+      <w:r>
+        <w:t xml:space="preserve">The field equations below are</w:t>
+      </w:r>
+      <w:r>
+        <w:t xml:space="preserve"> </w:t>
+      </w:r>
+      <w:r>
+        <w:rPr>
+          <w:i/>
+          <w:iCs/>
+        </w:rPr>
+        <w:t xml:space="preserve">posited by structural analogy</w:t>
+      </w:r>
+      <w:r>
+        <w:t xml:space="preserve">, not derived from an ethical action functional. The coupling constants</w:t>
+      </w:r>
+      <w:r>
+        <w:t xml:space="preserve"> </w:t>
+      </w:r>
+      <m:oMath>
+        <m:r>
+          <m:t>κ</m:t>
+        </m:r>
+        <m:r>
+          <m:rPr>
+            <m:sty m:val="p"/>
+          </m:rPr>
+          <m:t>,</m:t>
+        </m:r>
+        <m:r>
+          <m:t>λ</m:t>
+        </m:r>
+      </m:oMath>
+      <w:r>
+        <w:t xml:space="preserve"> </w:t>
+      </w:r>
+      <w:r>
+        <w:t xml:space="preserve">are unfixed and the fields</w:t>
+      </w:r>
+      <w:r>
+        <w:t xml:space="preserve"> </w:t>
+      </w:r>
+      <m:oMath>
+        <m:sSub>
+          <m:e>
+            <m:r>
+              <m:rPr>
+                <m:sty m:val="b"/>
+              </m:rPr>
+              <m:t>E</m:t>
+            </m:r>
+          </m:e>
+          <m:sub>
+            <m:r>
+              <m:rPr>
+                <m:nor/>
+                <m:sty m:val="p"/>
+              </m:rPr>
+              <m:t>ob</m:t>
+            </m:r>
+          </m:sub>
+        </m:sSub>
+        <m:r>
+          <m:rPr>
+            <m:sty m:val="p"/>
+          </m:rPr>
+          <m:t>,</m:t>
+        </m:r>
+        <m:sSub>
+          <m:e>
+            <m:r>
+              <m:rPr>
+                <m:sty m:val="b"/>
+              </m:rPr>
+              <m:t>B</m:t>
+            </m:r>
+          </m:e>
+          <m:sub>
+            <m:r>
+              <m:rPr>
+                <m:nor/>
+                <m:sty m:val="p"/>
+              </m:rPr>
+              <m:t>sys</m:t>
+            </m:r>
+          </m:sub>
+        </m:sSub>
+      </m:oMath>
+      <w:r>
+        <w:t xml:space="preserve"> </w:t>
+      </w:r>
+      <w:r>
+        <w:t xml:space="preserve">are not operationally measured. In particular, the continuity equation</w:t>
+      </w:r>
+      <w:r>
+        <w:t xml:space="preserve"> </w:t>
+      </w:r>
+      <w:r>
+        <w:t xml:space="preserve">“derived”</w:t>
+      </w:r>
+      <w:r>
+        <w:t xml:space="preserve"> </w:t>
+      </w:r>
+      <w:r>
+        <w:t xml:space="preserve">in §5.3 recovers the conservation structure that was</w:t>
+      </w:r>
+      <w:r>
+        <w:t xml:space="preserve"> </w:t>
+      </w:r>
+      <w:r>
+        <w:rPr>
+          <w:i/>
+          <w:iCs/>
+        </w:rPr>
+        <w:t xml:space="preserve">assumed</w:t>
+      </w:r>
+      <w:r>
+        <w:t xml:space="preserve"> </w:t>
+      </w:r>
+      <w:r>
+        <w:t xml:space="preserve">when the equations were written down—it is an internal consistency check on the analogy, not independent evidence for it. We include this section to show how far the correspondence can be pushed and to seed the research conjectures of §8, and we ask the reader to read it in that spirit. Nothing in §6–7 (the philosophical and AI-alignment payoffs) depends on these equations; those rest only on the coherence/invariance constraint of §4.</w:t>
       </w:r>
     </w:p>
     <w:bookmarkStart w:id="26" w:name="the-ethical-field-equations"/>
@@ -10341,7 +10701,7 @@
           <w:b/>
           <w:bCs/>
         </w:rPr>
-        <w:t xml:space="preserve">Definition 11</w:t>
+        <w:t xml:space="preserve">Definition 13</w:t>
       </w:r>
       <w:r>
         <w:t xml:space="preserve"> </w:t>
@@ -11765,7 +12125,7 @@
           <w:b/>
           <w:bCs/>
         </w:rPr>
-        <w:t xml:space="preserve">Conjecture 12</w:t>
+        <w:t xml:space="preserve">Conjecture 14</w:t>
       </w:r>
       <w:r>
         <w:t xml:space="preserve"> </w:t>
@@ -12224,7 +12584,7 @@
     </w:p>
     <w:bookmarkEnd w:id="45"/>
     <w:bookmarkEnd w:id="46"/>
-    <w:bookmarkStart w:id="52" w:name="discussion"/>
+    <w:bookmarkStart w:id="53" w:name="discussion"/>
     <w:p>
       <w:pPr>
         <w:pStyle w:val="Heading1"/>
@@ -13179,7 +13539,7 @@
         <w:t xml:space="preserve"> </w:t>
       </w:r>
       <w:r>
-        <w:t xml:space="preserve">showing perfect transfer (1.0) suggests that deontic structure—the distinction between what is required, permitted, and forbidden—is genuinely language-invariant, precisely as the gauge-theoretic framework predicts.</w:t>
+        <w:t xml:space="preserve">showing perfect transfer (1.0) suggests that deontic structure—the distinction between what is required, permitted, and forbidden—is genuinely language-invariant, consistent with the gauge-theoretic framework.</w:t>
       </w:r>
     </w:p>
     <w:p>
@@ -13191,14 +13551,477 @@
           <w:b/>
           <w:bCs/>
         </w:rPr>
-        <w:t xml:space="preserve">Verdict: STRONGLY_SUPPORTED</w:t>
-      </w:r>
-      <w:r>
-        <w:t xml:space="preserve">—The Noether-style conservation constraint on ethical reasoning finds substantial empirical support in cross-lingual transfer experiments.</w:t>
+        <w:t xml:space="preserve">A confound we must foreground.</w:t>
+      </w:r>
+      <w:r>
+        <w:t xml:space="preserve"> </w:t>
+      </w:r>
+      <w:r>
+        <w:t xml:space="preserve">The cross-lingual results are partly attributable to the</w:t>
+      </w:r>
+      <w:r>
+        <w:t xml:space="preserve"> </w:t>
+      </w:r>
+      <w:r>
+        <w:rPr>
+          <w:i/>
+          <w:iCs/>
+        </w:rPr>
+        <w:t xml:space="preserve">encoder</w:t>
+      </w:r>
+      <w:r>
+        <w:t xml:space="preserve"> </w:t>
+      </w:r>
+      <w:r>
+        <w:t xml:space="preserve">rather than to language-invariance of ethical structure</w:t>
+      </w:r>
+      <w:r>
+        <w:t xml:space="preserve"> </w:t>
+      </w:r>
+      <w:r>
+        <w:rPr>
+          <w:i/>
+          <w:iCs/>
+        </w:rPr>
+        <w:t xml:space="preserve">per se</w:t>
+      </w:r>
+      <w:r>
+        <w:t xml:space="preserve">. LaBSE is pretrained specifically to align translations in a shared embedding space; transfer of ethical labels across languages therefore conflates</w:t>
+      </w:r>
+      <w:r>
+        <w:t xml:space="preserve"> </w:t>
+      </w:r>
+      <w:r>
+        <w:t xml:space="preserve">“ethical structure is representation-invariant”</w:t>
+      </w:r>
+      <w:r>
+        <w:t xml:space="preserve"> </w:t>
+      </w:r>
+      <w:r>
+        <w:t xml:space="preserve">with</w:t>
+      </w:r>
+      <w:r>
+        <w:t xml:space="preserve"> </w:t>
+      </w:r>
+      <w:r>
+        <w:t xml:space="preserve">“the encoder already aligns languages.”</w:t>
+      </w:r>
+      <w:r>
+        <w:t xml:space="preserve"> </w:t>
+      </w:r>
+      <w:r>
+        <w:t xml:space="preserve">The low language-leakage (1.2%) and high cross-lingual similarity (86%) are exactly what a strong multilingual encoder produces regardless of any ethics-specific invariance. The cleaner, less-confounded signal is the</w:t>
+      </w:r>
+      <w:r>
+        <w:t xml:space="preserve"> </w:t>
+      </w:r>
+      <w:r>
+        <w:rPr>
+          <w:i/>
+          <w:iCs/>
+        </w:rPr>
+        <w:t xml:space="preserve">within-representation</w:t>
+      </w:r>
+      <w:r>
+        <w:t xml:space="preserve"> </w:t>
+      </w:r>
+      <w:r>
+        <w:rPr>
+          <w:b/>
+          <w:bCs/>
+        </w:rPr>
+        <w:t xml:space="preserve">structural/surface ratio (11.1x)</w:t>
+      </w:r>
+      <w:r>
+        <w:t xml:space="preserve">: it contrasts structural vs. surface perturbations inside the same encoder, so it is not explained by language alignment. A properly controlled test would (i) repeat the structural/surface contrast against a non-translation-aligned encoder, and (ii) treat the ratio, not cross-lingual transfer, as the primary endpoint.</w:t>
+      </w:r>
+    </w:p>
+    <w:p>
+      <w:pPr>
+        <w:pStyle w:val="BodyText"/>
+      </w:pPr>
+      <w:r>
+        <w:rPr>
+          <w:b/>
+          <w:bCs/>
+        </w:rPr>
+        <w:t xml:space="preserve">Verdict: SUPPORTED, with a stated encoder confound.</w:t>
+      </w:r>
+      <w:r>
+        <w:t xml:space="preserve">—The representation-invariance constraint finds real support in the structural/surface contrast; the cross-lingual transfer figures should be read as consistent-with rather than decisive, pending the controlled replication above. We deliberately downgrade the earlier</w:t>
+      </w:r>
+      <w:r>
+        <w:t xml:space="preserve"> </w:t>
+      </w:r>
+      <w:r>
+        <w:t xml:space="preserve">“strongly supported”</w:t>
+      </w:r>
+      <w:r>
+        <w:t xml:space="preserve"> </w:t>
+      </w:r>
+      <w:r>
+        <w:t xml:space="preserve">framing.</w:t>
       </w:r>
     </w:p>
     <w:bookmarkEnd w:id="50"/>
-    <w:bookmarkStart w:id="51" w:name="future-directions"/>
+    <w:bookmarkStart w:id="51" w:name="X491a1ffdd99aa348b815c395d95cc440c7e705e"/>
+    <w:p>
+      <w:pPr>
+        <w:pStyle w:val="Heading2"/>
+      </w:pPr>
+      <w:r>
+        <w:t xml:space="preserve">A Confound-Free Micro-Test: Negation Sensitivity</w:t>
+      </w:r>
+    </w:p>
+    <w:p>
+      <w:pPr>
+        <w:pStyle w:val="FirstParagraph"/>
+      </w:pPr>
+      <w:r>
+        <w:t xml:space="preserve">The sharpest test of representation-invariance needs no multilingual encoder at all. Negation is the cleanest case of a re-description that is</w:t>
+      </w:r>
+      <w:r>
+        <w:t xml:space="preserve"> </w:t>
+      </w:r>
+      <w:r>
+        <w:rPr>
+          <w:i/>
+          <w:iCs/>
+        </w:rPr>
+        <w:t xml:space="preserve">not</w:t>
+      </w:r>
+      <w:r>
+        <w:t xml:space="preserve"> </w:t>
+      </w:r>
+      <w:r>
+        <w:t xml:space="preserve">bond-preserving:</w:t>
+      </w:r>
+      <w:r>
+        <w:t xml:space="preserve"> </w:t>
+      </w:r>
+      <w:r>
+        <w:t xml:space="preserve">“the doctor lied”</w:t>
+      </w:r>
+      <w:r>
+        <w:t xml:space="preserve"> </w:t>
+      </w:r>
+      <w:r>
+        <w:t xml:space="preserve">and</w:t>
+      </w:r>
+      <w:r>
+        <w:t xml:space="preserve"> </w:t>
+      </w:r>
+      <w:r>
+        <w:t xml:space="preserve">“the doctor did not lie”</w:t>
+      </w:r>
+      <w:r>
+        <w:t xml:space="preserve"> </w:t>
+      </w:r>
+      <w:r>
+        <w:t xml:space="preserve">are surface-near but morally opposite, so a coherent evaluator must</w:t>
+      </w:r>
+      <w:r>
+        <w:t xml:space="preserve"> </w:t>
+      </w:r>
+      <w:r>
+        <w:rPr>
+          <w:i/>
+          <w:iCs/>
+        </w:rPr>
+        <w:t xml:space="preserve">distinguish</w:t>
+      </w:r>
+      <w:r>
+        <w:t xml:space="preserve"> </w:t>
+      </w:r>
+      <w:r>
+        <w:t xml:space="preserve">them while a surface/keyword evaluator cannot.</w:t>
+      </w:r>
+    </w:p>
+    <w:p>
+      <w:pPr>
+        <w:pStyle w:val="BodyText"/>
+      </w:pPr>
+      <w:r>
+        <w:t xml:space="preserve">On a minimal-pair corpus (prohibitions, imperfect duties, and merely-permissible acts, each in affirmed and negated form), we compare the ErisML compiler—which extracts a maxim with polarity via dependency parsing and applies the deontic gate—against a black-box scalar/keyword classifier that stands in for safety filters and reward models </w:t>
+      </w:r>
+      <w:r>
+        <w:t xml:space="preserve">:</w:t>
+      </w:r>
+    </w:p>
+    <w:tbl>
+      <w:tblPr>
+        <w:tblStyle w:val="Table"/>
+        <w:tblW w:type="auto" w:w="0"/>
+        <w:tblLook w:firstRow="1" w:lastRow="0" w:firstColumn="0" w:lastColumn="0" w:noHBand="0" w:noVBand="0" w:val="0020"/>
+      </w:tblPr>
+      <w:tblGrid>
+        <w:gridCol w:w="1980"/>
+        <w:gridCol w:w="1980"/>
+        <w:gridCol w:w="1980"/>
+        <w:gridCol w:w="1980"/>
+      </w:tblGrid>
+      <w:tr>
+        <w:trPr>
+          <w:tblHeader w:val="on"/>
+        </w:trPr>
+        <w:tc>
+          <w:tcPr/>
+          <w:p>
+            <w:pPr>
+              <w:pStyle w:val="Compact"/>
+              <w:jc w:val="left"/>
+            </w:pPr>
+            <w:r>
+              <w:rPr>
+                <w:b/>
+                <w:bCs/>
+              </w:rPr>
+              <w:t xml:space="preserve">System</w:t>
+            </w:r>
+          </w:p>
+        </w:tc>
+        <w:tc>
+          <w:tcPr/>
+          <w:p>
+            <w:pPr>
+              <w:pStyle w:val="Compact"/>
+              <w:jc w:val="center"/>
+            </w:pPr>
+            <w:r>
+              <w:rPr>
+                <w:b/>
+                <w:bCs/>
+              </w:rPr>
+              <w:t xml:space="preserve">overall</w:t>
+            </w:r>
+          </w:p>
+        </w:tc>
+        <w:tc>
+          <w:tcPr/>
+          <w:p>
+            <w:pPr>
+              <w:pStyle w:val="Compact"/>
+              <w:jc w:val="center"/>
+            </w:pPr>
+            <w:r>
+              <w:rPr>
+                <w:b/>
+                <w:bCs/>
+              </w:rPr>
+              <w:t xml:space="preserve">negated items</w:t>
+            </w:r>
+          </w:p>
+        </w:tc>
+        <w:tc>
+          <w:tcPr/>
+          <w:p>
+            <w:pPr>
+              <w:pStyle w:val="Compact"/>
+              <w:jc w:val="center"/>
+            </w:pPr>
+            <w:r>
+              <w:rPr>
+                <w:b/>
+                <w:bCs/>
+              </w:rPr>
+              <w:t xml:space="preserve">reasoning fields</w:t>
+            </w:r>
+          </w:p>
+        </w:tc>
+      </w:tr>
+      <w:tr>
+        <w:tc>
+          <w:tcPr/>
+          <w:p>
+            <w:pPr>
+              <w:pStyle w:val="Compact"/>
+              <w:jc w:val="left"/>
+            </w:pPr>
+            <w:r>
+              <w:t xml:space="preserve">ErisML compiler</w:t>
+            </w:r>
+          </w:p>
+        </w:tc>
+        <w:tc>
+          <w:tcPr/>
+          <w:p>
+            <w:pPr>
+              <w:pStyle w:val="Compact"/>
+              <w:jc w:val="center"/>
+            </w:pPr>
+            <w:r>
+              <w:t xml:space="preserve">100%</w:t>
+            </w:r>
+          </w:p>
+        </w:tc>
+        <w:tc>
+          <w:tcPr/>
+          <w:p>
+            <w:pPr>
+              <w:pStyle w:val="Compact"/>
+              <w:jc w:val="center"/>
+            </w:pPr>
+            <w:r>
+              <w:t xml:space="preserve">100%</w:t>
+            </w:r>
+          </w:p>
+        </w:tc>
+        <w:tc>
+          <w:tcPr/>
+          <w:p>
+            <w:pPr>
+              <w:pStyle w:val="Compact"/>
+              <w:jc w:val="center"/>
+            </w:pPr>
+            <w:r>
+              <w:t xml:space="preserve">4</w:t>
+            </w:r>
+          </w:p>
+        </w:tc>
+      </w:tr>
+      <w:tr>
+        <w:tc>
+          <w:tcPr/>
+          <w:p>
+            <w:pPr>
+              <w:pStyle w:val="Compact"/>
+              <w:jc w:val="left"/>
+            </w:pPr>
+            <w:r>
+              <w:t xml:space="preserve">Black-box scalar/keyword</w:t>
+            </w:r>
+          </w:p>
+        </w:tc>
+        <w:tc>
+          <w:tcPr/>
+          <w:p>
+            <w:pPr>
+              <w:pStyle w:val="Compact"/>
+              <w:jc w:val="center"/>
+            </w:pPr>
+            <w:r>
+              <w:t xml:space="preserve">58%</w:t>
+            </w:r>
+          </w:p>
+        </w:tc>
+        <w:tc>
+          <w:tcPr/>
+          <w:p>
+            <w:pPr>
+              <w:pStyle w:val="Compact"/>
+              <w:jc w:val="center"/>
+            </w:pPr>
+            <w:r>
+              <w:t xml:space="preserve">33%</w:t>
+            </w:r>
+          </w:p>
+        </w:tc>
+        <w:tc>
+          <w:tcPr/>
+          <w:p>
+            <w:pPr>
+              <w:pStyle w:val="Compact"/>
+              <w:jc w:val="center"/>
+            </w:pPr>
+            <w:r>
+              <w:t xml:space="preserve">0</w:t>
+            </w:r>
+          </w:p>
+        </w:tc>
+      </w:tr>
+    </w:tbl>
+    <w:p>
+      <w:pPr>
+        <w:pStyle w:val="BodyText"/>
+      </w:pPr>
+      <w:r>
+        <w:t xml:space="preserve">The keyword baseline forbids</w:t>
+      </w:r>
+      <w:r>
+        <w:t xml:space="preserve"> </w:t>
+      </w:r>
+      <w:r>
+        <w:t xml:space="preserve">“did not lie”</w:t>
+      </w:r>
+      <w:r>
+        <w:t xml:space="preserve"> </w:t>
+      </w:r>
+      <w:r>
+        <w:t xml:space="preserve">(the token</w:t>
+      </w:r>
+      <w:r>
+        <w:t xml:space="preserve"> </w:t>
+      </w:r>
+      <w:r>
+        <w:rPr>
+          <w:i/>
+          <w:iCs/>
+        </w:rPr>
+        <w:t xml:space="preserve">lie</w:t>
+      </w:r>
+      <w:r>
+        <w:t xml:space="preserve"> </w:t>
+      </w:r>
+      <w:r>
+        <w:t xml:space="preserve">is present) and even forbids</w:t>
+      </w:r>
+      <w:r>
+        <w:t xml:space="preserve"> </w:t>
+      </w:r>
+      <w:r>
+        <w:t xml:space="preserve">“helped the</w:t>
+      </w:r>
+      <w:r>
+        <w:t xml:space="preserve"> </w:t>
+      </w:r>
+      <w:r>
+        <w:rPr>
+          <w:i/>
+          <w:iCs/>
+        </w:rPr>
+        <w:t xml:space="preserve">injured</w:t>
+      </w:r>
+      <w:r>
+        <w:t xml:space="preserve"> </w:t>
+      </w:r>
+      <w:r>
+        <w:t xml:space="preserve">man”</w:t>
+      </w:r>
+      <w:r>
+        <w:t xml:space="preserve"> </w:t>
+      </w:r>
+      <w:r>
+        <w:t xml:space="preserve">(a harm word it cannot bind to the agent’s action); the structure-preserving pipeline tracks the maxim and its polarity, and emits an inspectable trace (action kind, polarity, contradiction type, justification). This is a small, hand-built probe targeting one phenomenon—not a broad moral-competence benchmark, and a modern LLM judge would handle the negation too (while still failing the auditability and determinism axes). But it is</w:t>
+      </w:r>
+      <w:r>
+        <w:t xml:space="preserve"> </w:t>
+      </w:r>
+      <w:r>
+        <w:rPr>
+          <w:i/>
+          <w:iCs/>
+        </w:rPr>
+        <w:t xml:space="preserve">confound-free</w:t>
+      </w:r>
+      <w:r>
+        <w:t xml:space="preserve">: it isolates representation-sensitivity with no encoder doing hidden work, and it is exactly the signature the BIP predicts—surface-invariance where the re-description is bond-preserving, and surface-</w:t>
+      </w:r>
+      <w:r>
+        <w:rPr>
+          <w:i/>
+          <w:iCs/>
+        </w:rPr>
+        <w:t xml:space="preserve">sensitivity</w:t>
+      </w:r>
+      <w:r>
+        <w:t xml:space="preserve"> </w:t>
+      </w:r>
+      <w:r>
+        <w:t xml:space="preserve">where it is not.</w:t>
+      </w:r>
+    </w:p>
+    <w:bookmarkEnd w:id="51"/>
+    <w:bookmarkStart w:id="52" w:name="future-directions"/>
     <w:p>
       <w:pPr>
         <w:pStyle w:val="Heading2"/>
@@ -13312,9 +14135,9 @@
         <w:t xml:space="preserve">Pursue the conjecture that physics, ethics, logic, and computation are instances of a single mathematical framework.</w:t>
       </w:r>
     </w:p>
-    <w:bookmarkEnd w:id="51"/>
     <w:bookmarkEnd w:id="52"/>
-    <w:bookmarkStart w:id="53" w:name="conclusion"/>
+    <w:bookmarkEnd w:id="53"/>
+    <w:bookmarkStart w:id="54" w:name="conclusion"/>
     <w:p>
       <w:pPr>
         <w:pStyle w:val="Heading1"/>
@@ -13529,8 +14352,8 @@
         <w:t xml:space="preserve">What unifies them, we do not yet fully know. But we have taken a step toward finding out.</w:t>
       </w:r>
     </w:p>
-    <w:bookmarkEnd w:id="53"/>
-    <w:bookmarkStart w:id="54" w:name="acknowledgments"/>
+    <w:bookmarkEnd w:id="54"/>
+    <w:bookmarkStart w:id="55" w:name="acknowledgments"/>
     <w:p>
       <w:pPr>
         <w:pStyle w:val="Heading1"/>
@@ -14026,8 +14849,8 @@
         <w:t xml:space="preserve">, ed. W. Zurek, Addison-Wesley, 1990.</w:t>
       </w:r>
     </w:p>
-    <w:bookmarkEnd w:id="54"/>
-    <w:bookmarkStart w:id="57" w:name="mathematical-details"/>
+    <w:bookmarkEnd w:id="55"/>
+    <w:bookmarkStart w:id="58" w:name="mathematical-details"/>
     <w:p>
       <w:pPr>
         <w:pStyle w:val="Heading1"/>
@@ -14036,7 +14859,7 @@
         <w:t xml:space="preserve">Mathematical Details</w:t>
       </w:r>
     </w:p>
-    <w:bookmarkStart w:id="55" w:name="noethers-theorem-full-statement"/>
+    <w:bookmarkStart w:id="56" w:name="noethers-theorem-full-statement"/>
     <w:p>
       <w:pPr>
         <w:pStyle w:val="Heading2"/>
@@ -14613,14 +15436,26 @@
         <w:t xml:space="preserve">arises if the Lagrangian changes by a total derivative.</w:t>
       </w:r>
     </w:p>
-    <w:bookmarkEnd w:id="55"/>
-    <w:bookmarkStart w:id="56" w:name="groupoid-noether-theorem"/>
+    <w:bookmarkEnd w:id="56"/>
+    <w:bookmarkStart w:id="57" w:name="X916d55814a1bc65e7417ad620538fca56cb69a4"/>
     <w:p>
       <w:pPr>
         <w:pStyle w:val="Heading2"/>
       </w:pPr>
       <w:r>
-        <w:t xml:space="preserve">Groupoid Noether Theorem</w:t>
+        <w:t xml:space="preserve">Invariants of a Groupoid Action (the discrete</w:t>
+      </w:r>
+      <w:r>
+        <w:t xml:space="preserve"> </w:t>
+      </w:r>
+      <w:r>
+        <w:t xml:space="preserve">“Noether”</w:t>
+      </w:r>
+      <w:r>
+        <w:t xml:space="preserve"> </w:t>
+      </w:r>
+      <w:r>
+        <w:t xml:space="preserve">analog)</w:t>
       </w:r>
     </w:p>
     <w:p>
@@ -14628,7 +15463,23 @@
         <w:pStyle w:val="FirstParagraph"/>
       </w:pPr>
       <w:r>
-        <w:t xml:space="preserve">For discrete groupoid symmetries, the analog of Noether’s theorem involves invariants of the groupoid action. If</w:t>
+        <w:t xml:space="preserve">For the discrete re-description groupoid the relevant fact is</w:t>
+      </w:r>
+      <w:r>
+        <w:t xml:space="preserve"> </w:t>
+      </w:r>
+      <w:r>
+        <w:rPr>
+          <w:i/>
+          <w:iCs/>
+        </w:rPr>
+        <w:t xml:space="preserve">not</w:t>
+      </w:r>
+      <w:r>
+        <w:t xml:space="preserve"> </w:t>
+      </w:r>
+      <w:r>
+        <w:t xml:space="preserve">a Noether-type theorem but the elementary observation that a</w:t>
       </w:r>
       <w:r>
         <w:t xml:space="preserve"> </w:t>
@@ -14643,16 +15494,31 @@
         </m:r>
       </m:oMath>
       <w:r>
-        <w:t xml:space="preserve"> </w:t>
-      </w:r>
-      <w:r>
-        <w:t xml:space="preserve">acts on a space</w:t>
+        <w:t xml:space="preserve">-invariant quantity descends to the orbit space. If</w:t>
       </w:r>
       <w:r>
         <w:t xml:space="preserve"> </w:t>
       </w:r>
       <m:oMath>
         <m:r>
+          <m:rPr>
+            <m:scr m:val="script"/>
+            <m:sty m:val="p"/>
+          </m:rPr>
+          <m:t>G</m:t>
+        </m:r>
+      </m:oMath>
+      <w:r>
+        <w:t xml:space="preserve"> </w:t>
+      </w:r>
+      <w:r>
+        <w:t xml:space="preserve">acts on</w:t>
+      </w:r>
+      <w:r>
+        <w:t xml:space="preserve"> </w:t>
+      </w:r>
+      <m:oMath>
+        <m:r>
           <m:t>X</m:t>
         </m:r>
       </m:oMath>
@@ -14660,7 +15526,7 @@
         <w:t xml:space="preserve"> </w:t>
       </w:r>
       <w:r>
-        <w:t xml:space="preserve">and a quantity</w:t>
+        <w:t xml:space="preserve">and</w:t>
       </w:r>
       <w:r>
         <w:t xml:space="preserve"> </w:t>
@@ -14696,12 +15562,77 @@
         <w:t xml:space="preserve"> </w:t>
       </w:r>
       <w:r>
-        <w:t xml:space="preserve">is</w:t>
+        <w:t xml:space="preserve">satisfies</w:t>
       </w:r>
       <w:r>
         <w:t xml:space="preserve"> </w:t>
       </w:r>
       <m:oMath>
+        <m:r>
+          <m:t>f</m:t>
+        </m:r>
+        <m:r>
+          <m:rPr>
+            <m:sty m:val="p"/>
+          </m:rPr>
+          <m:t>(</m:t>
+        </m:r>
+        <m:r>
+          <m:t>g</m:t>
+        </m:r>
+        <m:r>
+          <m:t>x</m:t>
+        </m:r>
+        <m:r>
+          <m:rPr>
+            <m:sty m:val="p"/>
+          </m:rPr>
+          <m:t>)</m:t>
+        </m:r>
+        <m:r>
+          <m:rPr>
+            <m:sty m:val="p"/>
+          </m:rPr>
+          <m:t>=</m:t>
+        </m:r>
+        <m:r>
+          <m:t>f</m:t>
+        </m:r>
+        <m:r>
+          <m:rPr>
+            <m:sty m:val="p"/>
+          </m:rPr>
+          <m:t>(</m:t>
+        </m:r>
+        <m:r>
+          <m:t>x</m:t>
+        </m:r>
+        <m:r>
+          <m:rPr>
+            <m:sty m:val="p"/>
+          </m:rPr>
+          <m:t>)</m:t>
+        </m:r>
+      </m:oMath>
+      <w:r>
+        <w:t xml:space="preserve"> </w:t>
+      </w:r>
+      <w:r>
+        <w:t xml:space="preserve">for all</w:t>
+      </w:r>
+      <w:r>
+        <w:t xml:space="preserve"> </w:t>
+      </w:r>
+      <m:oMath>
+        <m:r>
+          <m:t>g</m:t>
+        </m:r>
+        <m:r>
+          <m:rPr>
+            <m:sty m:val="p"/>
+          </m:rPr>
+          <m:t>∈</m:t>
+        </m:r>
         <m:r>
           <m:rPr>
             <m:scr m:val="script"/>
@@ -14711,73 +15642,34 @@
         </m:r>
       </m:oMath>
       <w:r>
-        <w:t xml:space="preserve">-invariant (</w:t>
+        <w:t xml:space="preserve">, then</w:t>
+      </w:r>
+      <w:r>
+        <w:t xml:space="preserve"> </w:t>
       </w:r>
       <m:oMath>
         <m:r>
           <m:t>f</m:t>
+        </m:r>
+      </m:oMath>
+      <w:r>
+        <w:t xml:space="preserve"> </w:t>
+      </w:r>
+      <w:r>
+        <w:t xml:space="preserve">factors through</w:t>
+      </w:r>
+      <w:r>
+        <w:t xml:space="preserve"> </w:t>
+      </w:r>
+      <m:oMath>
+        <m:r>
+          <m:t>X</m:t>
         </m:r>
         <m:r>
           <m:rPr>
             <m:sty m:val="p"/>
           </m:rPr>
-          <m:t>(</m:t>
-        </m:r>
-        <m:r>
-          <m:t>g</m:t>
-        </m:r>
-        <m:r>
-          <m:t>x</m:t>
-        </m:r>
-        <m:r>
-          <m:rPr>
-            <m:sty m:val="p"/>
-          </m:rPr>
-          <m:t>)</m:t>
-        </m:r>
-        <m:r>
-          <m:rPr>
-            <m:sty m:val="p"/>
-          </m:rPr>
-          <m:t>=</m:t>
-        </m:r>
-        <m:r>
-          <m:t>f</m:t>
-        </m:r>
-        <m:r>
-          <m:rPr>
-            <m:sty m:val="p"/>
-          </m:rPr>
-          <m:t>(</m:t>
-        </m:r>
-        <m:r>
-          <m:t>x</m:t>
-        </m:r>
-        <m:r>
-          <m:rPr>
-            <m:sty m:val="p"/>
-          </m:rPr>
-          <m:t>)</m:t>
-        </m:r>
-      </m:oMath>
-      <w:r>
-        <w:t xml:space="preserve"> </w:t>
-      </w:r>
-      <w:r>
-        <w:t xml:space="preserve">for all</w:t>
-      </w:r>
-      <w:r>
-        <w:t xml:space="preserve"> </w:t>
-      </w:r>
-      <m:oMath>
-        <m:r>
-          <m:t>g</m:t>
-        </m:r>
-        <m:r>
-          <m:rPr>
-            <m:sty m:val="p"/>
-          </m:rPr>
-          <m:t>∈</m:t>
+          <m:t>/</m:t>
         </m:r>
         <m:r>
           <m:rPr>
@@ -14788,35 +15680,64 @@
         </m:r>
       </m:oMath>
       <w:r>
-        <w:t xml:space="preserve">), then</w:t>
+        <w:t xml:space="preserve">. This is essentially the</w:t>
+      </w:r>
+      <w:r>
+        <w:t xml:space="preserve"> </w:t>
+      </w:r>
+      <w:r>
+        <w:rPr>
+          <w:i/>
+          <w:iCs/>
+        </w:rPr>
+        <w:t xml:space="preserve">definition</w:t>
+      </w:r>
+      <w:r>
+        <w:t xml:space="preserve"> </w:t>
+      </w:r>
+      <w:r>
+        <w:t xml:space="preserve">of invariance, not a consequence of dynamics; we call it</w:t>
+      </w:r>
+      <w:r>
+        <w:t xml:space="preserve"> </w:t>
+      </w:r>
+      <w:r>
+        <w:t xml:space="preserve">“Noether”</w:t>
+      </w:r>
+      <w:r>
+        <w:t xml:space="preserve"> </w:t>
+      </w:r>
+      <w:r>
+        <w:t xml:space="preserve">only by analogy with the continuous case, where a symmetry of an action produces a genuinely non-obvious conserved current.</w:t>
+      </w:r>
+    </w:p>
+    <w:p>
+      <w:pPr>
+        <w:pStyle w:val="BodyText"/>
+      </w:pPr>
+      <w:r>
+        <w:t xml:space="preserve">Accordingly, the framework</w:t>
+      </w:r>
+      <w:r>
+        <w:t xml:space="preserve"> </w:t>
+      </w:r>
+      <w:r>
+        <w:rPr>
+          <w:i/>
+          <w:iCs/>
+        </w:rPr>
+        <w:t xml:space="preserve">posits</w:t>
+      </w:r>
+      <w:r>
+        <w:t xml:space="preserve"> </w:t>
+      </w:r>
+      <w:r>
+        <w:t xml:space="preserve">harm to be among the</w:t>
       </w:r>
       <w:r>
         <w:t xml:space="preserve"> </w:t>
       </w:r>
       <m:oMath>
-        <m:r>
-          <m:t>f</m:t>
-        </m:r>
-      </m:oMath>
-      <w:r>
-        <w:t xml:space="preserve"> </w:t>
-      </w:r>
-      <w:r>
-        <w:t xml:space="preserve">descends to the orbit space</w:t>
-      </w:r>
-      <w:r>
-        <w:t xml:space="preserve"> </w:t>
-      </w:r>
-      <m:oMath>
-        <m:r>
-          <m:t>X</m:t>
-        </m:r>
-        <m:r>
-          <m:rPr>
-            <m:sty m:val="p"/>
-          </m:rPr>
-          <m:t>/</m:t>
-        </m:r>
         <m:r>
           <m:rPr>
             <m:scr m:val="script"/>
@@ -14826,62 +15747,12 @@
         </m:r>
       </m:oMath>
       <w:r>
-        <w:t xml:space="preserve">.</w:t>
-      </w:r>
-    </w:p>
-    <w:p>
-      <w:pPr>
-        <w:pStyle w:val="BodyText"/>
-      </w:pPr>
-      <w:r>
-        <w:t xml:space="preserve">The conserved</w:t>
-      </w:r>
-      <w:r>
-        <w:t xml:space="preserve"> </w:t>
-      </w:r>
-      <w:r>
-        <w:t xml:space="preserve">“charge”</w:t>
-      </w:r>
-      <w:r>
-        <w:t xml:space="preserve"> </w:t>
-      </w:r>
-      <w:r>
-        <w:t xml:space="preserve">is any</w:t>
-      </w:r>
-      <w:r>
-        <w:t xml:space="preserve"> </w:t>
-      </w:r>
-      <m:oMath>
-        <m:r>
-          <m:rPr>
-            <m:scr m:val="script"/>
-            <m:sty m:val="p"/>
-          </m:rPr>
-          <m:t>G</m:t>
-        </m:r>
-      </m:oMath>
-      <w:r>
-        <w:t xml:space="preserve">-invariant quantity. In the ethical context, harm is the</w:t>
-      </w:r>
-      <w:r>
-        <w:t xml:space="preserve"> </w:t>
-      </w:r>
-      <m:oMath>
-        <m:r>
-          <m:rPr>
-            <m:scr m:val="script"/>
-            <m:sty m:val="p"/>
-          </m:rPr>
-          <m:t>G</m:t>
-        </m:r>
-      </m:oMath>
-      <w:r>
-        <w:t xml:space="preserve">-invariant quantity under re-description symmetry.</w:t>
-      </w:r>
-    </w:p>
-    <w:bookmarkEnd w:id="56"/>
+        <w:t xml:space="preserve">-invariants under re-description; that is a modeling choice, not a derivation. The non-trivial, falsifiable content is then empirical: whether a given evaluator’s harm judgments actually respect the invariance.</w:t>
+      </w:r>
+    </w:p>
     <w:bookmarkEnd w:id="57"/>
-    <w:bookmarkStart w:id="58" w:name="the-ethical-stress-energy-tensor"/>
+    <w:bookmarkEnd w:id="58"/>
+    <w:bookmarkStart w:id="59" w:name="the-ethical-stress-energy-tensor"/>
     <w:p>
       <w:pPr>
         <w:pStyle w:val="Heading1"/>
@@ -15273,8 +16144,8 @@
         <w:t xml:space="preserve">—the total moral intensity and flow in a closed system.</w:t>
       </w:r>
     </w:p>
-    <w:bookmarkEnd w:id="58"/>
-    <w:bookmarkStart w:id="59" w:name="toward-quantum-ethics"/>
+    <w:bookmarkEnd w:id="59"/>
+    <w:bookmarkStart w:id="60" w:name="toward-quantum-ethics"/>
     <w:p>
       <w:pPr>
         <w:pStyle w:val="Heading1"/>
@@ -15422,7 +16293,7 @@
         <w:t xml:space="preserve">This is highly speculative but points toward a rich research program.</w:t>
       </w:r>
     </w:p>
-    <w:bookmarkEnd w:id="59"/>
+    <w:bookmarkEnd w:id="60"/>
     <w:sectPr>
       <w:footnotePr>
         <w:numRestart w:val="eachSect"/>

</xml_diff>